<commit_message>
chore: update documentation and configurator layout adjustments
</commit_message>
<xml_diff>
--- a/docs/TimeTraveler_FeatureIndex.docx
+++ b/docs/TimeTraveler_FeatureIndex.docx
@@ -23510,6 +23510,235 @@
       <w:pPr>
         <w:spacing w:after="100" w:before="200"/>
       </w:pPr>
+    </w:p>
+    <w:p>
+      <w:pPr>
+        <w:pStyle w:val="Heading1"/>
+      </w:pPr>
+      <w:r>
+        <w:t>Current Implementation Status Update</w:t>
+      </w:r>
+    </w:p>
+    <w:p>
+      <w:r>
+        <w:t>Updated: June 2026. This section records the current React/Vite prototype state after the timeline, parent dashboard, and Lego minifig configurator updates.</w:t>
+      </w:r>
+    </w:p>
+    <w:p>
+      <w:pPr>
+        <w:pStyle w:val="Heading2"/>
+      </w:pPr>
+      <w:r>
+        <w:t>Implemented / Verified</w:t>
+      </w:r>
+    </w:p>
+    <w:p>
+      <w:pPr>
+        <w:pStyle w:val="ListParagraph"/>
+      </w:pPr>
+      <w:r>
+        <w:t>F-01 / F-05 Timeline: panning, inertia, zoom controls, date rollover, neighboring-day context, and always-visible now footer indicator.</w:t>
+      </w:r>
+    </w:p>
+    <w:p>
+      <w:pPr>
+        <w:pStyle w:val="ListParagraph"/>
+      </w:pPr>
+      <w:r>
+        <w:t>F-02 Mascot: active-profile SVG Lego minifig appears on the timeline with walking/action hooks.</w:t>
+      </w:r>
+    </w:p>
+    <w:p>
+      <w:pPr>
+        <w:pStyle w:val="ListParagraph"/>
+      </w:pPr>
+      <w:r>
+        <w:t>F-03 / F-19 Routine Bricks: status styling, zoom-aware widths, drag scheduling, resize handle, completion, skip, and current-day interaction guard.</w:t>
+      </w:r>
+    </w:p>
+    <w:p>
+      <w:pPr>
+        <w:pStyle w:val="ListParagraph"/>
+      </w:pPr>
+      <w:r>
+        <w:t>F-17 / F-20 Parent Controls: PIN gate, parent dashboard, logs, profile editor, routine add/edit/delete/reset, today-only vs series updates.</w:t>
+      </w:r>
+    </w:p>
+    <w:p>
+      <w:pPr>
+        <w:pStyle w:val="ListParagraph"/>
+      </w:pPr>
+      <w:r>
+        <w:t>Multi-day routine support: parent duration input is in minutes, stored internally as hours, and long blocks can span across midnight.</w:t>
+      </w:r>
+    </w:p>
+    <w:p>
+      <w:pPr>
+        <w:pStyle w:val="ListParagraph"/>
+      </w:pPr>
+      <w:r>
+        <w:t>F-31 Mood Station: 2D mood and energy joystick implemented.</w:t>
+      </w:r>
+    </w:p>
+    <w:p>
+      <w:pPr>
+        <w:pStyle w:val="ListParagraph"/>
+      </w:pPr>
+      <w:r>
+        <w:t>Cadet Configurator: heads/expressions, headwear/hair, torso/outfits, legs, accessories/tools, ability chips, central preview, save/preview layout, and profile-specific minifig state.</w:t>
+      </w:r>
+    </w:p>
+    <w:p>
+      <w:pPr>
+        <w:pStyle w:val="ListParagraph"/>
+      </w:pPr>
+      <w:r>
+        <w:t>Sky/Backdrop: Amsterdam sunrise/sunset, moon visibility and phase, clouds, city/mountain scenery, and date/time widget.</w:t>
+      </w:r>
+    </w:p>
+    <w:p>
+      <w:pPr>
+        <w:pStyle w:val="ListParagraph"/>
+      </w:pPr>
+      <w:r>
+        <w:t>Code health: npm run lint and npm run build pass.</w:t>
+      </w:r>
+    </w:p>
+    <w:p>
+      <w:pPr>
+        <w:pStyle w:val="Heading2"/>
+      </w:pPr>
+      <w:r>
+        <w:t>Partially Implemented</w:t>
+      </w:r>
+    </w:p>
+    <w:p>
+      <w:pPr>
+        <w:pStyle w:val="ListParagraph"/>
+      </w:pPr>
+      <w:r>
+        <w:t>F-18 Done-Stamping has trophy styling, sound, particles, and logs; physics-based falling stud particles and structured scheduled/actual log fields remain pending.</w:t>
+      </w:r>
+    </w:p>
+    <w:p>
+      <w:pPr>
+        <w:pStyle w:val="ListParagraph"/>
+      </w:pPr>
+      <w:r>
+        <w:t>F-04 Temporal Zoom has button controls; pinch-to-zoom and Deconstruction Bin capacity linkage remain pending.</w:t>
+      </w:r>
+    </w:p>
+    <w:p>
+      <w:pPr>
+        <w:pStyle w:val="ListParagraph"/>
+      </w:pPr>
+      <w:r>
+        <w:t>F-12 / F-13 Constraints and ripple movement are implemented for current-day task dragging; missed-task prompts remain pending.</w:t>
+      </w:r>
+    </w:p>
+    <w:p>
+      <w:pPr>
+        <w:pStyle w:val="ListParagraph"/>
+      </w:pPr>
+      <w:r>
+        <w:t>Profile data stores minifig configuration per profile; schedules, logs, templates, and surprise reveal state still need profile scoping.</w:t>
+      </w:r>
+    </w:p>
+    <w:p>
+      <w:pPr>
+        <w:pStyle w:val="Heading2"/>
+      </w:pPr>
+      <w:r>
+        <w:t>Pending Major Features</w:t>
+      </w:r>
+    </w:p>
+    <w:p>
+      <w:pPr>
+        <w:pStyle w:val="ListParagraph"/>
+      </w:pPr>
+      <w:r>
+        <w:t>F-07 / F-08 Stop-Motion Day-in-Review and narrative stitching.</w:t>
+      </w:r>
+    </w:p>
+    <w:p>
+      <w:pPr>
+        <w:pStyle w:val="ListParagraph"/>
+      </w:pPr>
+      <w:r>
+        <w:t>F-09 / F-10 / F-11 countdowns, active progress builder, and time pressure cues.</w:t>
+      </w:r>
+    </w:p>
+    <w:p>
+      <w:pPr>
+        <w:pStyle w:val="ListParagraph"/>
+      </w:pPr>
+      <w:r>
+        <w:t>F-14 / F-15 / F-16 weekly templates, day banners, and preparation alerts.</w:t>
+      </w:r>
+    </w:p>
+    <w:p>
+      <w:pPr>
+        <w:pStyle w:val="ListParagraph"/>
+      </w:pPr>
+      <w:r>
+        <w:t>F-24 / F-25 / F-26 garbage truck cleanup, mystery boxes, and vanishing surprise behavior.</w:t>
+      </w:r>
+    </w:p>
+    <w:p>
+      <w:pPr>
+        <w:pStyle w:val="ListParagraph"/>
+      </w:pPr>
+      <w:r>
+        <w:t>F-34 / F-35 / F-36 bedtime mode, appreciation ledger, and gratitude audio logs.</w:t>
+      </w:r>
+    </w:p>
+    <w:p>
+      <w:pPr>
+        <w:pStyle w:val="ListParagraph"/>
+      </w:pPr>
+      <w:r>
+        <w:t>F-F01 through F-F06 family junction/coupling features.</w:t>
+      </w:r>
+    </w:p>
+    <w:p>
+      <w:pPr>
+        <w:pStyle w:val="ListParagraph"/>
+      </w:pPr>
+      <w:r>
+        <w:t>F-S01 through F-S07 social rails, ghost wagons, notice boards, and privacy boundary features.</w:t>
+      </w:r>
+    </w:p>
+    <w:p>
+      <w:pPr>
+        <w:pStyle w:val="Heading2"/>
+      </w:pPr>
+      <w:r>
+        <w:t>Technical Follow-ups</w:t>
+      </w:r>
+    </w:p>
+    <w:p>
+      <w:pPr>
+        <w:pStyle w:val="ListParagraph"/>
+      </w:pPr>
+      <w:r>
+        <w:t>Add automated tests around time conversion, day rollover, duration conversion, parent edit flow, and drag constraints.</w:t>
+      </w:r>
+    </w:p>
+    <w:p>
+      <w:pPr>
+        <w:pStyle w:val="ListParagraph"/>
+      </w:pPr>
+      <w:r>
+        <w:t>Add LocalStorage schema versioning and migration.</w:t>
+      </w:r>
+    </w:p>
+    <w:p>
+      <w:pPr>
+        <w:pStyle w:val="ListParagraph"/>
+      </w:pPr>
+      <w:r>
+        <w:t>Replace hardcoded parent PIN with configurable local PIN setup.</w:t>
+      </w:r>
     </w:p>
     <w:sectPr>
       <w:pgSz w:w="12240" w:h="15840" w:orient="portrait"/>

</xml_diff>